<commit_message>
fix: contract template dots overflow + signature layout + stamp position defaults
</commit_message>
<xml_diff>
--- a/dainganxanh-landing/templates/contract-template.docx
+++ b/dainganxanh-landing/templates/contract-template.docx
@@ -950,64 +950,64 @@
           <w:sz w:val="24"/>
           <w:lang w:val="vi-VN"/>
         </w:rPr>
-        <w:t>Quốc tịch: . . . . . . . . . . . . . . . . . . . . . . . . . . . .</w:t>
-      </w:r>
-    </w:p>
-    <w:p>
-      <w:pPr>
-        <w:spacing w:line="360" w:lineRule="auto"/>
-        <w:jc w:val="both"/>
-        <w:rPr>
-          <w:rFonts w:asciiTheme="majorHAnsi" w:hAnsiTheme="majorHAnsi" w:cstheme="majorHAnsi"/>
-          <w:sz w:val="24"/>
-          <w:lang w:val="vi-VN"/>
-        </w:rPr>
-      </w:pPr>
-      <w:r>
-        <w:rPr>
-          <w:rFonts w:asciiTheme="majorHAnsi" w:hAnsiTheme="majorHAnsi" w:cstheme="majorHAnsi"/>
-          <w:sz w:val="24"/>
-          <w:lang w:val="vi-VN"/>
-        </w:rPr>
-        <w:t xml:space="preserve">Số CCCD: . . . . . . . . . . . . . . . . . . . .  Ngày cấp: . . . . . . . . . . . . . . .  Nơi cấp: . . . . . . . . . . . . . . . . . . . . . </w:t>
-      </w:r>
-    </w:p>
-    <w:p>
-      <w:pPr>
-        <w:spacing w:line="360" w:lineRule="auto"/>
-        <w:jc w:val="both"/>
-        <w:rPr>
-          <w:rFonts w:asciiTheme="majorHAnsi" w:hAnsiTheme="majorHAnsi" w:cstheme="majorHAnsi"/>
-          <w:sz w:val="24"/>
-          <w:lang w:val="vi-VN"/>
-        </w:rPr>
-      </w:pPr>
-      <w:r>
-        <w:rPr>
-          <w:rFonts w:asciiTheme="majorHAnsi" w:hAnsiTheme="majorHAnsi" w:cstheme="majorHAnsi"/>
-          <w:sz w:val="24"/>
-          <w:lang w:val="vi-VN"/>
-        </w:rPr>
-        <w:t>Địa chỉ: . . . . . . . . . . . . . . . . . . . . . . . . . . . . . . . . . . . . . . . . . . . . . . . . . . . . . . . . . . . . . . . . . . . . . . . . . . . .</w:t>
-      </w:r>
-    </w:p>
-    <w:p>
-      <w:pPr>
-        <w:spacing w:line="360" w:lineRule="auto"/>
-        <w:jc w:val="both"/>
-        <w:rPr>
-          <w:rFonts w:asciiTheme="majorHAnsi" w:hAnsiTheme="majorHAnsi" w:cstheme="majorHAnsi"/>
-          <w:sz w:val="24"/>
-          <w:lang w:val="vi-VN"/>
-        </w:rPr>
-      </w:pPr>
-      <w:r>
-        <w:rPr>
-          <w:rFonts w:asciiTheme="majorHAnsi" w:hAnsiTheme="majorHAnsi" w:cstheme="majorHAnsi"/>
-          <w:sz w:val="24"/>
-          <w:lang w:val="vi-VN"/>
-        </w:rPr>
-        <w:t>Điện thoại: . . . . . . . . . . . . . . . . . . . . . . . . . . . . . . . . . . . . . . . . . . . . . . . . . . . . . . . . . . . . . . . . . . . . . . . . .</w:t>
+        <w:t>Quốc tịch: . . . . . . . . . . . . . . . .</w:t>
+      </w:r>
+    </w:p>
+    <w:p>
+      <w:pPr>
+        <w:spacing w:line="360" w:lineRule="auto"/>
+        <w:jc w:val="both"/>
+        <w:rPr>
+          <w:rFonts w:asciiTheme="majorHAnsi" w:hAnsiTheme="majorHAnsi" w:cstheme="majorHAnsi"/>
+          <w:sz w:val="24"/>
+          <w:lang w:val="vi-VN"/>
+        </w:rPr>
+      </w:pPr>
+      <w:r>
+        <w:rPr>
+          <w:rFonts w:asciiTheme="majorHAnsi" w:hAnsiTheme="majorHAnsi" w:cstheme="majorHAnsi"/>
+          <w:sz w:val="24"/>
+          <w:lang w:val="vi-VN"/>
+        </w:rPr>
+        <w:t>Số CCCD: . . . . . . . . . . . . .  Ngày cấp: . . . . . . . . . .  Nơi cấp: . . . . . . . .</w:t>
+      </w:r>
+    </w:p>
+    <w:p>
+      <w:pPr>
+        <w:spacing w:line="360" w:lineRule="auto"/>
+        <w:jc w:val="both"/>
+        <w:rPr>
+          <w:rFonts w:asciiTheme="majorHAnsi" w:hAnsiTheme="majorHAnsi" w:cstheme="majorHAnsi"/>
+          <w:sz w:val="24"/>
+          <w:lang w:val="vi-VN"/>
+        </w:rPr>
+      </w:pPr>
+      <w:r>
+        <w:rPr>
+          <w:rFonts w:asciiTheme="majorHAnsi" w:hAnsiTheme="majorHAnsi" w:cstheme="majorHAnsi"/>
+          <w:sz w:val="24"/>
+          <w:lang w:val="vi-VN"/>
+        </w:rPr>
+        <w:t>Địa chỉ: . . . . . . . . . . . . . . . . . . . . . . . . . . . . . . .</w:t>
+      </w:r>
+    </w:p>
+    <w:p>
+      <w:pPr>
+        <w:spacing w:line="360" w:lineRule="auto"/>
+        <w:jc w:val="both"/>
+        <w:rPr>
+          <w:rFonts w:asciiTheme="majorHAnsi" w:hAnsiTheme="majorHAnsi" w:cstheme="majorHAnsi"/>
+          <w:sz w:val="24"/>
+          <w:lang w:val="vi-VN"/>
+        </w:rPr>
+      </w:pPr>
+      <w:r>
+        <w:rPr>
+          <w:rFonts w:asciiTheme="majorHAnsi" w:hAnsiTheme="majorHAnsi" w:cstheme="majorHAnsi"/>
+          <w:sz w:val="24"/>
+          <w:lang w:val="vi-VN"/>
+        </w:rPr>
+        <w:t>Điện thoại: . . . . . . . . . . . . . . . . . . . . .</w:t>
       </w:r>
     </w:p>
     <w:p>
@@ -5502,7 +5502,7 @@
           <w:szCs w:val="22"/>
           <w:lang w:val="vi-VN"/>
         </w:rPr>
-        <w:t>….</w:t>
+        <w:t>{{ho_ten}}</w:t>
       </w:r>
       <w:r>
         <w:rPr>
@@ -5515,6 +5515,8 @@
           <w:lang w:val="vi-VN"/>
         </w:rPr>
         <w:tab/>
+        <w:tab/>
+        <w:tab/>
       </w:r>
       <w:r>
         <w:rPr>
@@ -5526,7 +5528,6 @@
           <w:szCs w:val="22"/>
           <w:lang w:val="vi-VN"/>
         </w:rPr>
-        <w:tab/>
       </w:r>
       <w:r>
         <w:rPr>
@@ -5536,7 +5537,6 @@
           <w:szCs w:val="22"/>
           <w:lang w:val="vi-VN"/>
         </w:rPr>
-        <w:tab/>
       </w:r>
       <w:r>
         <w:rPr>
@@ -5546,7 +5546,6 @@
           <w:szCs w:val="22"/>
           <w:lang w:val="vi-VN"/>
         </w:rPr>
-        <w:tab/>
       </w:r>
       <w:r>
         <w:rPr>
@@ -5556,7 +5555,6 @@
           <w:szCs w:val="22"/>
           <w:lang w:val="vi-VN"/>
         </w:rPr>
-        <w:tab/>
       </w:r>
       <w:r>
         <w:rPr>
@@ -5566,7 +5564,6 @@
           <w:szCs w:val="22"/>
           <w:lang w:val="vi-VN"/>
         </w:rPr>
-        <w:tab/>
       </w:r>
       <w:r>
         <w:rPr>
@@ -5576,7 +5573,6 @@
           <w:szCs w:val="22"/>
           <w:lang w:val="vi-VN"/>
         </w:rPr>
-        <w:tab/>
         <w:t xml:space="preserve">       </w:t>
       </w:r>
       <w:r>

</xml_diff>